<commit_message>
Update report draft to reflect CodeCarbon-measured energy/CO2
Updates the results table with CodeCarbon-derived figures (Ireland grid)
instead of the earlier constant-wattage proxy, and rewrites the
methodology and limitations text accordingly, including the residual
caveat that this sandbox lacks RAPL hardware counters so CodeCarbon itself
falls back to a CPU-load/TDP estimation model.
</commit_message>
<xml_diff>
--- a/report/TABA_H9ETS_draft.docx
+++ b/report/TABA_H9ETS_draft.docx
@@ -587,7 +587,7 @@
           <w:sz w:val="24"/>
           <w:szCs w:val="24"/>
         </w:rPr>
-        <w:t xml:space="preserve">Sustainability cost was measured per run as wall-clock training/inference time, energy (estimated as constant-power draw x elapsed time, using an assumed 15 W CPU-share proxy since hardware-level energy measurement (e.g. CodeCarbon on real hardware) was not available in the execution sandbox used for this project - this is a stated limitation, see Section 6), resulting CO2e (using a global-average grid intensity of 429 gCO2/kWh), and serialized model size in KB.</w:t>
+        <w:t xml:space="preserve">Sustainability cost was measured per run as wall-clock training/inference time, energy and CO2e (using CodeCarbon's OfflineEmissionsTracker, locked to Ireland's grid carbon intensity), and serialized model size in KB. CodeCarbon is a peer-reviewed, widely used Green AI measurement tool, but a residual limitation should be noted: the execution sandbox used for this project does not expose Intel RAPL hardware power counters, so CodeCarbon itself falls back to a CPU-load/TDP-based estimation model rather than a true hardware wall-power reading - see Section 6. The relative comparison between models and strategies (driven primarily by measured wall-clock time, which is exact) remains meaningful; absolute kWh/CO2e figures should be read as standardised estimates rather than directly measured hardware values.</w:t>
       </w:r>
     </w:p>
     <w:p>
@@ -998,7 +998,7 @@
                 <w:sz w:val="18"/>
                 <w:szCs w:val="18"/>
               </w:rPr>
-              <w:t xml:space="preserve">7.0e-9</w:t>
+              <w:t xml:space="preserve">6.01e-08</w:t>
             </w:r>
           </w:p>
         </w:tc>
@@ -1136,7 +1136,7 @@
                 <w:sz w:val="18"/>
                 <w:szCs w:val="18"/>
               </w:rPr>
-              <w:t xml:space="preserve">1.1e-6</w:t>
+              <w:t xml:space="preserve">1.60e-06</w:t>
             </w:r>
           </w:p>
         </w:tc>
@@ -1274,7 +1274,7 @@
                 <w:sz w:val="18"/>
                 <w:szCs w:val="18"/>
               </w:rPr>
-              <w:t xml:space="preserve">4.8e-6</w:t>
+              <w:t xml:space="preserve">7.88e-06</w:t>
             </w:r>
           </w:p>
         </w:tc>
@@ -1412,7 +1412,7 @@
                 <w:sz w:val="18"/>
                 <w:szCs w:val="18"/>
               </w:rPr>
-              <w:t xml:space="preserve">1.5e-6</w:t>
+              <w:t xml:space="preserve">8.89e-07</w:t>
             </w:r>
           </w:p>
         </w:tc>
@@ -1550,7 +1550,7 @@
                 <w:sz w:val="18"/>
                 <w:szCs w:val="18"/>
               </w:rPr>
-              <w:t xml:space="preserve">5.3e-9</w:t>
+              <w:t xml:space="preserve">9.46e-10</w:t>
             </w:r>
           </w:p>
         </w:tc>
@@ -1688,7 +1688,7 @@
                 <w:sz w:val="18"/>
                 <w:szCs w:val="18"/>
               </w:rPr>
-              <w:t xml:space="preserve">1.1e-6</w:t>
+              <w:t xml:space="preserve">1.23e-06</w:t>
             </w:r>
           </w:p>
         </w:tc>
@@ -1826,7 +1826,7 @@
                 <w:sz w:val="18"/>
                 <w:szCs w:val="18"/>
               </w:rPr>
-              <w:t xml:space="preserve">5.1e-6</w:t>
+              <w:t xml:space="preserve">7.79e-06</w:t>
             </w:r>
           </w:p>
         </w:tc>
@@ -1964,7 +1964,7 @@
                 <w:sz w:val="18"/>
                 <w:szCs w:val="18"/>
               </w:rPr>
-              <w:t xml:space="preserve">1.5e-6</w:t>
+              <w:t xml:space="preserve">9.24e-07</w:t>
             </w:r>
           </w:p>
         </w:tc>
@@ -2102,7 +2102,7 @@
                 <w:sz w:val="18"/>
                 <w:szCs w:val="18"/>
               </w:rPr>
-              <w:t xml:space="preserve">4.7e-9</w:t>
+              <w:t xml:space="preserve">1.80e-09</w:t>
             </w:r>
           </w:p>
         </w:tc>
@@ -2240,7 +2240,7 @@
                 <w:sz w:val="18"/>
                 <w:szCs w:val="18"/>
               </w:rPr>
-              <w:t xml:space="preserve">7.7e-7</w:t>
+              <w:t xml:space="preserve">1.15e-06</w:t>
             </w:r>
           </w:p>
         </w:tc>
@@ -2378,7 +2378,7 @@
                 <w:sz w:val="18"/>
                 <w:szCs w:val="18"/>
               </w:rPr>
-              <w:t xml:space="preserve">2.8e-6</w:t>
+              <w:t xml:space="preserve">3.84e-06</w:t>
             </w:r>
           </w:p>
         </w:tc>
@@ -2516,7 +2516,7 @@
                 <w:sz w:val="18"/>
                 <w:szCs w:val="18"/>
               </w:rPr>
-              <w:t xml:space="preserve">1.7e-6</w:t>
+              <w:t xml:space="preserve">1.08e-06</w:t>
             </w:r>
           </w:p>
         </w:tc>
@@ -3090,7 +3090,7 @@
           <w:sz w:val="24"/>
           <w:szCs w:val="24"/>
         </w:rPr>
-        <w:t xml:space="preserve">Future work should: measure energy directly on target hardware (e.g. CodeCarbon/RAPL) rather than via the time-based proxy used here; evaluate on the official PHM 2012 held-out Test_set bearings rather than only Learning_set siblings; model operating condition explicitly (e.g. condition-specific models or condition as an input feature) instead of assuming a single global model; and, following Juodelyte et al. (2022), evaluate whether reframing the task as degradation-stage classification rather than continuous RUL regression further improves cross-bearing generalisation, which the within-condition diagnostics in this report suggest is the dataset's main limiting factor.</w:t>
+        <w:t xml:space="preserve">Future work should: measure energy on hardware that exposes RAPL/NVML counters so CodeCarbon can report true wall-power readings rather than its CPU-load/TDP fallback, as used here; evaluate on the official PHM 2012 held-out Test_set bearings rather than only Learning_set siblings; model operating condition explicitly (e.g. condition-specific models or condition as an input feature) instead of assuming a single global model; and, following Juodelyte et al. (2022), evaluate whether reframing the task as degradation-stage classification rather than continuous RUL regression further improves cross-bearing generalisation, which the within-condition diagnostics in this report suggest is the dataset's main limiting factor.</w:t>
       </w:r>
     </w:p>
     <w:p>

</xml_diff>